<commit_message>
Update Sterelin role to Administrative Officer and add referees
Add Nancy's Administrative Officer duties at Sterelin Medical and
Diagnostics to the portfolio and CV, add her new skills, and list her
three referees on the public CV with contact details on request.

Co-Authored-By: Claude Opus 5.5 <noreply@anthropic.com>
Claude-Session: https://claude.ai/code/session_0156aZM3qPnDqHSDP631BThZ
</commit_message>
<xml_diff>
--- a/Nancy_Chibwe_Lemba_CV.docx
+++ b/Nancy_Chibwe_Lemba_CV.docx
@@ -13,7 +13,7 @@
     <w:p>
       <w:pPr/>
       <w:r>
-        <w:t xml:space="preserve">Administrative Assistant | Executive Support | Immigration and Travel Coordination</w:t>
+        <w:t xml:space="preserve">Administrative Officer | Executive Support | Immigration and Travel Coordination</w:t>
       </w:r>
     </w:p>
     <w:p>
@@ -33,7 +33,7 @@
     <w:p>
       <w:pPr/>
       <w:r>
-        <w:t xml:space="preserve">Administrative professional with over nine years of experience supporting chief executives and senior management at Hollard Life Assurance, ZTE and Samsung in Lusaka. Skilled in executive and diary support, expatriate work permit and immigration coordination, travel and accommodation logistics, procurement and records management. A diploma in Information Systems and Programming and hands-on IT support experience make new office systems quick to adopt. Trusted with confidential information and known for keeping busy executive offices running smoothly.</w:t>
+        <w:t xml:space="preserve">Administrative professional with over nine years of experience supporting chief executives and senior management at Hollard Life Assurance, ZTE and Samsung in Lusaka, now Administrative Officer at Sterelin Medical and Diagnostics. Skilled in executive and diary support, office operations, expatriate work permit and immigration coordination, travel and accommodation logistics, procurement, invoice and petty cash administration, and records management. A diploma in Information Systems and Programming and hands-on IT support experience make new office systems quick to adopt. Trusted with confidential information and known for keeping busy executive offices running smoothly.</w:t>
       </w:r>
     </w:p>
     <w:p>
@@ -189,6 +189,30 @@
       </w:r>
     </w:p>
     <w:p>
+      <w:pPr>
+        <w:pStyle w:val="ListParagraph"/>
+        <w:numPr>
+          <w:ilvl w:val="0"/>
+          <w:numId w:val="2"/>
+        </w:numPr>
+      </w:pPr>
+      <w:r>
+        <w:t xml:space="preserve">Invoice processing, petty cash records and expenditure tracking</w:t>
+      </w:r>
+    </w:p>
+    <w:p>
+      <w:pPr>
+        <w:pStyle w:val="ListParagraph"/>
+        <w:numPr>
+          <w:ilvl w:val="0"/>
+          <w:numId w:val="2"/>
+        </w:numPr>
+      </w:pPr>
+      <w:r>
+        <w:t xml:space="preserve">Staff attendance, leave records and HR support</w:t>
+      </w:r>
+    </w:p>
+    <w:p>
       <w:pPr/>
       <w:r>
         <w:t xml:space="preserve">Technical skills: Microsoft Word, Excel and PowerPoint; IT systems support, data backups and network maintenance.</w:t>
@@ -206,6 +230,144 @@
       </w:pPr>
       <w:r>
         <w:t xml:space="preserve">Professional Experience</w:t>
+      </w:r>
+    </w:p>
+    <w:p>
+      <w:pPr/>
+      <w:r>
+        <w:rPr>
+          <w:b/>
+        </w:rPr>
+        <w:t xml:space="preserve">Administrative Officer</w:t>
+      </w:r>
+      <w:r>
+        <w:t xml:space="preserve">, Sterelin Medical and Diagnostics Limited, Lusaka</w:t>
+      </w:r>
+    </w:p>
+    <w:p>
+      <w:pPr/>
+      <w:r>
+        <w:t xml:space="preserve">March 2026 to present</w:t>
+      </w:r>
+    </w:p>
+    <w:p>
+      <w:pPr>
+        <w:pStyle w:val="ListParagraph"/>
+        <w:numPr>
+          <w:ilvl w:val="0"/>
+          <w:numId w:val="3"/>
+        </w:numPr>
+      </w:pPr>
+      <w:r>
+        <w:t xml:space="preserve">Coordinate daily office operations and provide administrative support to management.</w:t>
+      </w:r>
+    </w:p>
+    <w:p>
+      <w:pPr>
+        <w:pStyle w:val="ListParagraph"/>
+        <w:numPr>
+          <w:ilvl w:val="0"/>
+          <w:numId w:val="3"/>
+        </w:numPr>
+      </w:pPr>
+      <w:r>
+        <w:t xml:space="preserve">Maintain accurate company records, staff files, correspondence and filing systems.</w:t>
+      </w:r>
+    </w:p>
+    <w:p>
+      <w:pPr>
+        <w:pStyle w:val="ListParagraph"/>
+        <w:numPr>
+          <w:ilvl w:val="0"/>
+          <w:numId w:val="3"/>
+        </w:numPr>
+      </w:pPr>
+      <w:r>
+        <w:t xml:space="preserve">Prepare reports, official letters, meeting minutes and other administrative documents.</w:t>
+      </w:r>
+    </w:p>
+    <w:p>
+      <w:pPr>
+        <w:pStyle w:val="ListParagraph"/>
+        <w:numPr>
+          <w:ilvl w:val="0"/>
+          <w:numId w:val="3"/>
+        </w:numPr>
+      </w:pPr>
+      <w:r>
+        <w:t xml:space="preserve">Support procurement activities, monitor office supplies and liaise with suppliers.</w:t>
+      </w:r>
+    </w:p>
+    <w:p>
+      <w:pPr>
+        <w:pStyle w:val="ListParagraph"/>
+        <w:numPr>
+          <w:ilvl w:val="0"/>
+          <w:numId w:val="3"/>
+        </w:numPr>
+      </w:pPr>
+      <w:r>
+        <w:t xml:space="preserve">Coordinate customer enquiries, order documentation, deliveries and communication between departments.</w:t>
+      </w:r>
+    </w:p>
+    <w:p>
+      <w:pPr>
+        <w:pStyle w:val="ListParagraph"/>
+        <w:numPr>
+          <w:ilvl w:val="0"/>
+          <w:numId w:val="3"/>
+        </w:numPr>
+      </w:pPr>
+      <w:r>
+        <w:t xml:space="preserve">Assist with invoice processing, payment documentation, petty cash records and administrative expenditure tracking.</w:t>
+      </w:r>
+    </w:p>
+    <w:p>
+      <w:pPr>
+        <w:pStyle w:val="ListParagraph"/>
+        <w:numPr>
+          <w:ilvl w:val="0"/>
+          <w:numId w:val="3"/>
+        </w:numPr>
+      </w:pPr>
+      <w:r>
+        <w:t xml:space="preserve">Maintain staff attendance and leave records and support human resource activities.</w:t>
+      </w:r>
+    </w:p>
+    <w:p>
+      <w:pPr>
+        <w:pStyle w:val="ListParagraph"/>
+        <w:numPr>
+          <w:ilvl w:val="0"/>
+          <w:numId w:val="3"/>
+        </w:numPr>
+      </w:pPr>
+      <w:r>
+        <w:t xml:space="preserve">Coordinate logistics, transport arrangements and office equipment maintenance.</w:t>
+      </w:r>
+    </w:p>
+    <w:p>
+      <w:pPr>
+        <w:pStyle w:val="ListParagraph"/>
+        <w:numPr>
+          <w:ilvl w:val="0"/>
+          <w:numId w:val="3"/>
+        </w:numPr>
+      </w:pPr>
+      <w:r>
+        <w:t xml:space="preserve">Ensure proper documentation, confidentiality and compliance with company policies and procedures.</w:t>
+      </w:r>
+    </w:p>
+    <w:p>
+      <w:pPr>
+        <w:pStyle w:val="ListParagraph"/>
+        <w:numPr>
+          <w:ilvl w:val="0"/>
+          <w:numId w:val="3"/>
+        </w:numPr>
+      </w:pPr>
+      <w:r>
+        <w:t xml:space="preserve">Prepare administrative reports and perform other duties assigned by management.</w:t>
       </w:r>
     </w:p>
     <w:p>
@@ -217,36 +379,6 @@
         <w:t xml:space="preserve">Administrative Assistant</w:t>
       </w:r>
       <w:r>
-        <w:t xml:space="preserve">, Sterelin Medical and Diagnostics Ltd, Lusaka</w:t>
-      </w:r>
-    </w:p>
-    <w:p>
-      <w:pPr/>
-      <w:r>
-        <w:t xml:space="preserve">March 2026 to present</w:t>
-      </w:r>
-    </w:p>
-    <w:p>
-      <w:pPr>
-        <w:pStyle w:val="ListParagraph"/>
-        <w:numPr>
-          <w:ilvl w:val="0"/>
-          <w:numId w:val="3"/>
-        </w:numPr>
-      </w:pPr>
-      <w:r>
-        <w:t xml:space="preserve">Provide administrative support to management at a medical and diagnostics supply company.</w:t>
-      </w:r>
-    </w:p>
-    <w:p>
-      <w:pPr/>
-      <w:r>
-        <w:rPr>
-          <w:b/>
-        </w:rPr>
-        <w:t xml:space="preserve">Administrative Assistant</w:t>
-      </w:r>
-      <w:r>
         <w:t xml:space="preserve">, Hollard Life Assurance Zambia Limited, Lusaka</w:t>
       </w:r>
     </w:p>
@@ -569,12 +701,51 @@
     <w:p>
       <w:pPr/>
       <w:r>
-        <w:t>Available on request.</w:t>
+        <w:rPr>
+          <w:b/>
+        </w:rPr>
+        <w:t xml:space="preserve">Memory Mwale</w:t>
+      </w:r>
+      <w:r>
+        <w:t xml:space="preserve">, Administration Officer, Sterelin Medical and Diagnostics Limited</w:t>
+      </w:r>
+    </w:p>
+    <w:p>
+      <w:pPr/>
+      <w:r>
+        <w:rPr>
+          <w:b/>
+        </w:rPr>
+        <w:t xml:space="preserve">Edith Zikonda</w:t>
+      </w:r>
+      <w:r>
+        <w:t xml:space="preserve">, Operations Officer, Hollard Life Assurance</w:t>
+      </w:r>
+    </w:p>
+    <w:p>
+      <w:pPr/>
+      <w:r>
+        <w:rPr>
+          <w:b/>
+        </w:rPr>
+        <w:t xml:space="preserve">Elizabeth Moyo</w:t>
+      </w:r>
+      <w:r>
+        <w:t xml:space="preserve">, Human Resources Manager, Samsung Electronics</w:t>
+      </w:r>
+    </w:p>
+    <w:p>
+      <w:pPr/>
+      <w:r>
+        <w:rPr>
+          <w:i/>
+        </w:rPr>
+        <w:t xml:space="preserve">Contact details available on request.</w:t>
       </w:r>
     </w:p>
     <w:sectPr>
       <w:pgSz w:w="11906" w:h="16838"/>
-      <w:pgMar w:top="1134" w:right="1134" w:bottom="1134" w:left="1134" w:header="720" w:footer="720" w:gutter="0"/>
+      <w:pgMar w:top="850" w:right="1020" w:bottom="850" w:left="1020" w:header="720" w:footer="720" w:gutter="0"/>
     </w:sectPr>
   </w:body>
 </w:document>
@@ -787,7 +958,7 @@
     </w:rPrDefault>
     <w:pPrDefault>
       <w:pPr>
-        <w:spacing w:after="160" w:line="259" w:lineRule="auto"/>
+        <w:spacing w:after="100" w:line="250" w:lineRule="auto"/>
       </w:pPr>
     </w:pPrDefault>
   </w:docDefaults>

</xml_diff>

<commit_message>
List referee contact details in Nancy's public CV
At Nancy's request, the public CV now shows each referee's phone number
instead of "Contact details available on request", and the site and
README point to the CV for referee details.

Co-Authored-By: Claude Opus 5.5 <noreply@anthropic.com>
Claude-Session: https://claude.ai/code/session_0156aZM3qPnDqHSDP631BThZ
</commit_message>
<xml_diff>
--- a/Nancy_Chibwe_Lemba_CV.docx
+++ b/Nancy_Chibwe_Lemba_CV.docx
@@ -707,7 +707,7 @@
         <w:t xml:space="preserve">Memory Mwale</w:t>
       </w:r>
       <w:r>
-        <w:t xml:space="preserve">, Administration Officer, Sterelin Medical and Diagnostics Limited</w:t>
+        <w:t xml:space="preserve">, Administration Officer, Sterelin Medical and Diagnostics Limited, +260 972 193 799</w:t>
       </w:r>
     </w:p>
     <w:p>
@@ -719,7 +719,7 @@
         <w:t xml:space="preserve">Edith Zikonda</w:t>
       </w:r>
       <w:r>
-        <w:t xml:space="preserve">, Operations Officer, Hollard Life Assurance</w:t>
+        <w:t xml:space="preserve">, Operations Officer, Hollard Life Assurance, +260 976 551 947</w:t>
       </w:r>
     </w:p>
     <w:p>
@@ -731,16 +731,7 @@
         <w:t xml:space="preserve">Elizabeth Moyo</w:t>
       </w:r>
       <w:r>
-        <w:t xml:space="preserve">, Human Resources Manager, Samsung Electronics</w:t>
-      </w:r>
-    </w:p>
-    <w:p>
-      <w:pPr/>
-      <w:r>
-        <w:rPr>
-          <w:i/>
-        </w:rPr>
-        <w:t xml:space="preserve">Contact details available on request.</w:t>
+        <w:t xml:space="preserve">, Human Resources Manager, Samsung Electronics, +260 972 733 714</w:t>
       </w:r>
     </w:p>
     <w:sectPr>

</xml_diff>

<commit_message>
Add a portfolio QR code and link to Nancy's CV
Place a QR code that opens the portfolio in the top right of the CV,
captioned "Scan to view my portfolio", and add a clickable portfolio
link under the contact details. Bump the CV link version so browsers
fetch the new file.

Co-Authored-By: Claude Opus 5.5 <noreply@anthropic.com>
Claude-Session: https://claude.ai/code/session_0156aZM3qPnDqHSDP631BThZ
</commit_message>
<xml_diff>
--- a/Nancy_Chibwe_Lemba_CV.docx
+++ b/Nancy_Chibwe_Lemba_CV.docx
@@ -7,6 +7,51 @@
         <w:pStyle w:val="Heading1"/>
       </w:pPr>
       <w:r>
+        <w:drawing>
+          <wp:anchor distT="0" distB="0" distL="180000" distR="0" simplePos="0" relativeHeight="251659264" behindDoc="0" locked="0" layoutInCell="1" allowOverlap="1">
+            <wp:simplePos x="0" y="0"/>
+            <wp:positionH relativeFrom="margin">
+              <wp:align>right</wp:align>
+            </wp:positionH>
+            <wp:positionV relativeFrom="margin">
+              <wp:posOffset>0</wp:posOffset>
+            </wp:positionV>
+            <wp:extent cx="936000" cy="1221366"/>
+            <wp:effectExtent l="0" t="0" r="0" b="0"/>
+            <wp:wrapSquare wrapText="left"/>
+            <wp:docPr id="101" name="Portfolio QR code" descr="QR code: scan to view my portfolio at https://jojejr123.github.io/nancy-chibwe-lemba/"/>
+            <wp:cNvGraphicFramePr>
+              <a:graphicFrameLocks noChangeAspect="1"/>
+            </wp:cNvGraphicFramePr>
+            <a:graphic>
+              <a:graphicData uri="http://schemas.openxmlformats.org/drawingml/2006/picture">
+                <pic:pic>
+                  <pic:nvPicPr>
+                    <pic:cNvPr id="101" name="portfolio_qr.png"/>
+                    <pic:cNvPicPr/>
+                  </pic:nvPicPr>
+                  <pic:blipFill>
+                    <a:blip r:embed="rIdQR"/>
+                    <a:stretch>
+                      <a:fillRect/>
+                    </a:stretch>
+                  </pic:blipFill>
+                  <pic:spPr>
+                    <a:xfrm>
+                      <a:off x="0" y="0"/>
+                      <a:ext cx="936000" cy="1221366"/>
+                    </a:xfrm>
+                    <a:prstGeom prst="rect">
+                      <a:avLst/>
+                    </a:prstGeom>
+                  </pic:spPr>
+                </pic:pic>
+              </a:graphicData>
+            </a:graphic>
+          </wp:anchor>
+        </w:drawing>
+      </w:r>
+      <w:r>
         <w:t xml:space="preserve">Nancy Chibwe Lemba</w:t>
       </w:r>
     </w:p>
@@ -20,6 +65,26 @@
       <w:pPr/>
       <w:r>
         <w:t xml:space="preserve">Lusaka, Zambia | +260 978 316 030 | nancychibwe@gmail.com</w:t>
+      </w:r>
+    </w:p>
+    <w:p>
+      <w:pPr/>
+      <w:r>
+        <w:rPr>
+          <w:b/>
+        </w:rPr>
+        <w:t xml:space="preserve">Portfolio: </w:t>
+      </w:r>
+      <w:hyperlink r:id="rIdPF">
+        <w:r>
+          <w:rPr>
+            <w:rStyle w:val="Hyperlink"/>
+          </w:rPr>
+          <w:t xml:space="preserve">jojejr123.github.io/nancy-chibwe-lemba</w:t>
+        </w:r>
+      </w:hyperlink>
+      <w:r>
+        <w:t xml:space="preserve"> (or scan the QR code)</w:t>
       </w:r>
     </w:p>
     <w:p>

</xml_diff>